<commit_message>
C: Update lab,and project pages; add new publication and course details (#61)
</commit_message>
<xml_diff>
--- a/docs/teaching/SPROuT/SPROuT_flyer.docx
+++ b/docs/teaching/SPROuT/SPROuT_flyer.docx
@@ -19,18 +19,18 @@
           <wp:inline>
             <wp:extent cx="2857500" cy="2857500"/>
             <wp:effectExtent b="0" l="0" r="0" t="0"/>
-            <wp:docPr descr="" title="" id="21" name="Picture"/>
+            <wp:docPr descr="" title="" id="10" name="Picture"/>
             <a:graphic>
               <a:graphicData uri="http://schemas.openxmlformats.org/drawingml/2006/picture">
                 <pic:pic>
                   <pic:nvPicPr>
-                    <pic:cNvPr descr="sprout_logo_blue.jpg" id="22" name="Picture"/>
+                    <pic:cNvPr descr="sprout_logo_blue.jpg" id="11" name="Picture"/>
                     <pic:cNvPicPr>
                       <a:picLocks noChangeArrowheads="1" noChangeAspect="1"/>
                     </pic:cNvPicPr>
                   </pic:nvPicPr>
                   <pic:blipFill>
-                    <a:blip r:embed="rId20"/>
+                    <a:blip r:embed="rId9"/>
                     <a:stretch>
                       <a:fillRect/>
                     </a:stretch>
@@ -78,7 +78,7 @@
         <w:t xml:space="preserve">.</w:t>
       </w:r>
     </w:p>
-    <w:bookmarkStart w:id="23" w:name="why-join-sprout"/>
+    <w:bookmarkStart w:id="12" w:name="why-join-sprout"/>
     <w:p>
       <w:pPr>
         <w:pStyle w:val="Heading2"/>
@@ -123,8 +123,8 @@
         <w:t xml:space="preserve">Would you love to involve a collaborator, but explaining your project structure is overwhelming?</w:t>
       </w:r>
     </w:p>
-    <w:bookmarkEnd w:id="23"/>
-    <w:bookmarkStart w:id="24" w:name="there-is-a-better-way-join-sprout"/>
+    <w:bookmarkEnd w:id="12"/>
+    <w:bookmarkStart w:id="13" w:name="there-is-a-better-way-join-sprout"/>
     <w:p>
       <w:pPr>
         <w:pStyle w:val="Heading2"/>
@@ -133,8 +133,8 @@
         <w:t xml:space="preserve">There is a better way! Join SPROuT!</w:t>
       </w:r>
     </w:p>
-    <w:bookmarkEnd w:id="24"/>
-    <w:bookmarkStart w:id="25" w:name="expected-learning-outcomes"/>
+    <w:bookmarkEnd w:id="13"/>
+    <w:bookmarkStart w:id="14" w:name="expected-learning-outcomes"/>
     <w:p>
       <w:pPr>
         <w:pStyle w:val="Heading2"/>
@@ -255,8 +255,8 @@
         <w:t xml:space="preserve">Navigate and solve real-world challenges🛠️ in a team setting👥.</w:t>
       </w:r>
     </w:p>
-    <w:bookmarkEnd w:id="25"/>
-    <w:bookmarkStart w:id="26" w:name="workshop-details"/>
+    <w:bookmarkEnd w:id="14"/>
+    <w:bookmarkStart w:id="15" w:name="workshop-details"/>
     <w:p>
       <w:pPr>
         <w:pStyle w:val="Heading2"/>
@@ -341,8 +341,8 @@
         <w:t xml:space="preserve">.</w:t>
       </w:r>
     </w:p>
-    <w:bookmarkEnd w:id="26"/>
-    <w:bookmarkStart w:id="30" w:name="scan-the-qr-code-for-more-info"/>
+    <w:bookmarkEnd w:id="15"/>
+    <w:bookmarkStart w:id="19" w:name="scan-the-qr-code-for-more-info"/>
     <w:p>
       <w:pPr>
         <w:pStyle w:val="Heading2"/>
@@ -360,18 +360,18 @@
           <wp:inline>
             <wp:extent cx="5334000" cy="5334000"/>
             <wp:effectExtent b="0" l="0" r="0" t="0"/>
-            <wp:docPr descr="" title="" id="28" name="Picture"/>
+            <wp:docPr descr="" title="" id="17" name="Picture"/>
             <a:graphic>
               <a:graphicData uri="http://schemas.openxmlformats.org/drawingml/2006/picture">
                 <pic:pic>
                   <pic:nvPicPr>
-                    <pic:cNvPr descr="../..\teaching//SPROuT/qr_code.png" id="29" name="Picture"/>
+                    <pic:cNvPr descr="../..\teaching//SPROuT/qr_code.png" id="18" name="Picture"/>
                     <pic:cNvPicPr>
                       <a:picLocks noChangeArrowheads="1" noChangeAspect="1"/>
                     </pic:cNvPicPr>
                   </pic:nvPicPr>
                   <pic:blipFill>
-                    <a:blip r:embed="rId27"/>
+                    <a:blip r:embed="rId16"/>
                     <a:stretch>
                       <a:fillRect/>
                     </a:stretch>
@@ -398,7 +398,7 @@
         </w:drawing>
       </w:r>
     </w:p>
-    <w:bookmarkEnd w:id="30"/>
+    <w:bookmarkEnd w:id="19"/>
     <w:sectPr>
       <w:footnotePr>
         <w:numRestart w:val="eachSect"/>
@@ -632,10 +632,10 @@
   <w:docDefaults>
     <w:rPrDefault>
       <w:rPr>
-        <w:rFonts w:asciiTheme="minorHAnsi" w:cstheme="minorBidi" w:eastAsiaTheme="minorHAnsi" w:hAnsiTheme="minorHAnsi"/>
+        <w:rFonts w:asciiTheme="minorHAnsi" w:cstheme="minorBidi" w:eastAsiaTheme="minorEastAsia" w:hAnsiTheme="minorHAnsi"/>
         <w:sz w:val="24"/>
         <w:szCs w:val="24"/>
-        <w:lang w:bidi="ar-SA" w:eastAsia="en-US" w:val="en-US"/>
+        <w:lang w:bidi="ar-SA" w:eastAsia="zh-CN" w:val="en-US"/>
       </w:rPr>
     </w:rPrDefault>
     <w:pPrDefault>
@@ -1176,13 +1176,6 @@
       </w:tblCellMar>
     </w:tblPr>
     <w:tblStylePr w:type="firstRow">
-      <w:tblPr>
-        <w:jc w:val="left"/>
-        <w:tblInd w:type="dxa" w:w="0"/>
-      </w:tblPr>
-      <w:trPr>
-        <w:jc w:val="left"/>
-      </w:trPr>
       <w:tcPr>
         <w:tcBorders>
           <w:bottom w:val="single"/>

</xml_diff>